<commit_message>
Clean up Fig 3, add J/R decomposition to manuscript
- Rewrote Figure 3 with larger fonts, no overlapping text
- Added 'Analytical proof: rho constrains J/R decomposition' Results
  subsection to manuscript: ||J||_F = (1+rho^2)/sqrt(2), d=1.31
- Updated manuscript docx
</commit_message>
<xml_diff>
--- a/manuscript/PNAS_PortHamiltonian_Revised.docx
+++ b/manuscript/PNAS_PortHamiltonian_Revised.docx
@@ -521,6 +521,243 @@
           <w:szCs w:val="22"/>
         </w:rPr>
         <w:t xml:space="preserve"> = 0.99), confirming that ρ extracted from electrophysiological time series is a reliable proxy for the port-Hamiltonian dissipation balance.</w:t>
+      </w:r>
+    </w:p>
+    <w:p>
+      <w:pPr>
+        <w:pStyle w:val="Heading2"/>
+        <w:spacing w:before="280" w:after="160"/>
+      </w:pPr>
+      <w:r>
+        <w:rPr>
+          <w:rFonts w:ascii="Arial" w:cs="Arial" w:eastAsia="Arial" w:hAnsi="Arial"/>
+          <w:b/>
+          <w:bCs/>
+          <w:sz w:val="24"/>
+          <w:szCs w:val="24"/>
+        </w:rPr>
+        <w:t xml:space="preserve">Analytical proof: ρ constrains the J/R decomposition</w:t>
+      </w:r>
+    </w:p>
+    <w:p>
+      <w:pPr>
+        <w:spacing w:after="200" w:line="276"/>
+        <w:jc w:val="both"/>
+      </w:pPr>
+      <w:r>
+        <w:rPr>
+          <w:rFonts w:ascii="Arial" w:cs="Arial" w:eastAsia="Arial" w:hAnsi="Arial"/>
+          <w:sz w:val="22"/>
+          <w:szCs w:val="22"/>
+        </w:rPr>
+        <w:t xml:space="preserve">The link between ρ and the port-Hamiltonian structure can be established analytically, without simulation. The AR(2) model yields a 2×2 companion matrix A = [[a</w:t>
+      </w:r>
+      <w:r>
+        <w:rPr>
+          <w:rFonts w:ascii="Arial" w:cs="Arial" w:eastAsia="Arial" w:hAnsi="Arial"/>
+          <w:sz w:val="22"/>
+          <w:szCs w:val="22"/>
+          <w:vertAlign w:val="superscript"/>
+        </w:rPr>
+        <w:t xml:space="preserve">1</w:t>
+      </w:r>
+      <w:r>
+        <w:rPr>
+          <w:rFonts w:ascii="Arial" w:cs="Arial" w:eastAsia="Arial" w:hAnsi="Arial"/>
+          <w:sz w:val="22"/>
+          <w:szCs w:val="22"/>
+        </w:rPr>
+        <w:t xml:space="preserve">, a</w:t>
+      </w:r>
+      <w:r>
+        <w:rPr>
+          <w:rFonts w:ascii="Arial" w:cs="Arial" w:eastAsia="Arial" w:hAnsi="Arial"/>
+          <w:sz w:val="22"/>
+          <w:szCs w:val="22"/>
+          <w:vertAlign w:val="superscript"/>
+        </w:rPr>
+        <w:t xml:space="preserve">2</w:t>
+      </w:r>
+      <w:r>
+        <w:rPr>
+          <w:rFonts w:ascii="Arial" w:cs="Arial" w:eastAsia="Arial" w:hAnsi="Arial"/>
+          <w:sz w:val="22"/>
+          <w:szCs w:val="22"/>
+        </w:rPr>
+        <w:t xml:space="preserve">], [1, 0]]. Decomposing A into skew-symmetric (Ĵ = (A − A</w:t>
+      </w:r>
+      <w:r>
+        <w:rPr>
+          <w:rFonts w:ascii="Arial" w:cs="Arial" w:eastAsia="Arial" w:hAnsi="Arial"/>
+          <w:sz w:val="22"/>
+          <w:szCs w:val="22"/>
+          <w:vertAlign w:val="superscript"/>
+        </w:rPr>
+        <w:t xml:space="preserve">T</w:t>
+      </w:r>
+      <w:r>
+        <w:rPr>
+          <w:rFonts w:ascii="Arial" w:cs="Arial" w:eastAsia="Arial" w:hAnsi="Arial"/>
+          <w:sz w:val="22"/>
+          <w:szCs w:val="22"/>
+        </w:rPr>
+        <w:t xml:space="preserve">)/2) and symmetric (Ŝ = (A + A</w:t>
+      </w:r>
+      <w:r>
+        <w:rPr>
+          <w:rFonts w:ascii="Arial" w:cs="Arial" w:eastAsia="Arial" w:hAnsi="Arial"/>
+          <w:sz w:val="22"/>
+          <w:szCs w:val="22"/>
+          <w:vertAlign w:val="superscript"/>
+        </w:rPr>
+        <w:t xml:space="preserve">T</w:t>
+      </w:r>
+      <w:r>
+        <w:rPr>
+          <w:rFonts w:ascii="Arial" w:cs="Arial" w:eastAsia="Arial" w:hAnsi="Arial"/>
+          <w:sz w:val="22"/>
+          <w:szCs w:val="22"/>
+        </w:rPr>
+        <w:t xml:space="preserve">)/2) components—where Ĵ captures conservative (oscillatory) dynamics and R̂ = −Ŝ captures dissipation—yields a closed-form result: ||Ĵ||</w:t>
+      </w:r>
+      <w:r>
+        <w:rPr>
+          <w:rFonts w:ascii="Arial" w:cs="Arial" w:eastAsia="Arial" w:hAnsi="Arial"/>
+          <w:sz w:val="22"/>
+          <w:szCs w:val="22"/>
+          <w:vertAlign w:val="superscript"/>
+        </w:rPr>
+        <w:t xml:space="preserve">F</w:t>
+      </w:r>
+      <w:r>
+        <w:rPr>
+          <w:rFonts w:ascii="Arial" w:cs="Arial" w:eastAsia="Arial" w:hAnsi="Arial"/>
+          <w:sz w:val="22"/>
+          <w:szCs w:val="22"/>
+        </w:rPr>
+        <w:t xml:space="preserve"> = (1 + ρ²)/√2. The Frobenius norm of the conservative component is a </w:t>
+      </w:r>
+      <w:r>
+        <w:rPr>
+          <w:rFonts w:ascii="Arial" w:cs="Arial" w:eastAsia="Arial" w:hAnsi="Arial"/>
+          <w:i/>
+          <w:iCs/>
+          <w:sz w:val="22"/>
+          <w:szCs w:val="22"/>
+        </w:rPr>
+        <w:t xml:space="preserve">pure function of ρ</w:t>
+      </w:r>
+      <w:r>
+        <w:rPr>
+          <w:rFonts w:ascii="Arial" w:cs="Arial" w:eastAsia="Arial" w:hAnsi="Arial"/>
+          <w:sz w:val="22"/>
+          <w:szCs w:val="22"/>
+        </w:rPr>
+        <w:t xml:space="preserve">, monotonically increasing, with no dependence on oscillation frequency or any free parameter (Figure 3A). This provides a direct, assumption-free proof that ρ constrains the J component of the port-Hamiltonian decomposition.</w:t>
+      </w:r>
+    </w:p>
+    <w:p>
+      <w:pPr>
+        <w:spacing w:after="200" w:line="276"/>
+        <w:ind w:firstLine="360"/>
+        <w:jc w:val="both"/>
+      </w:pPr>
+      <w:r>
+        <w:rPr>
+          <w:rFonts w:ascii="Arial" w:cs="Arial" w:eastAsia="Arial" w:hAnsi="Arial"/>
+          <w:sz w:val="22"/>
+          <w:szCs w:val="22"/>
+        </w:rPr>
+        <w:t xml:space="preserve">The dissipative component ||Ŝ||</w:t>
+      </w:r>
+      <w:r>
+        <w:rPr>
+          <w:rFonts w:ascii="Arial" w:cs="Arial" w:eastAsia="Arial" w:hAnsi="Arial"/>
+          <w:sz w:val="22"/>
+          <w:szCs w:val="22"/>
+          <w:vertAlign w:val="superscript"/>
+        </w:rPr>
+        <w:t xml:space="preserve">F</w:t>
+      </w:r>
+      <w:r>
+        <w:rPr>
+          <w:rFonts w:ascii="Arial" w:cs="Arial" w:eastAsia="Arial" w:hAnsi="Arial"/>
+          <w:sz w:val="22"/>
+          <w:szCs w:val="22"/>
+        </w:rPr>
+        <w:t xml:space="preserve"> depends on both ρ and frequency, but within any frequency band the mapping from ρ to the dissipative fraction ||Ŝ||/(||Ĵ||+||Ŝ||) is monotonically decreasing (</w:t>
+      </w:r>
+      <w:r>
+        <w:rPr>
+          <w:rFonts w:ascii="Arial" w:cs="Arial" w:eastAsia="Arial" w:hAnsi="Arial"/>
+          <w:i/>
+          <w:iCs/>
+          <w:sz w:val="22"/>
+          <w:szCs w:val="22"/>
+        </w:rPr>
+        <w:t xml:space="preserve">r</w:t>
+      </w:r>
+      <w:r>
+        <w:rPr>
+          <w:rFonts w:ascii="Arial" w:cs="Arial" w:eastAsia="Arial" w:hAnsi="Arial"/>
+          <w:sz w:val="22"/>
+          <w:szCs w:val="22"/>
+        </w:rPr>
+        <w:t xml:space="preserve"> &gt; 0.997 in every band; Figure 3B). The dissipative fraction gradient across cortical regions replicates the ρ gradient with amplified effect size: the alpha-band dorsoventral Ĵ/R̂ gradient yields Cohen’s </w:t>
+      </w:r>
+      <w:r>
+        <w:rPr>
+          <w:rFonts w:ascii="Arial" w:cs="Arial" w:eastAsia="Arial" w:hAnsi="Arial"/>
+          <w:i/>
+          <w:iCs/>
+          <w:sz w:val="22"/>
+          <w:szCs w:val="22"/>
+        </w:rPr>
+        <w:t xml:space="preserve">d</w:t>
+      </w:r>
+      <w:r>
+        <w:rPr>
+          <w:rFonts w:ascii="Arial" w:cs="Arial" w:eastAsia="Arial" w:hAnsi="Arial"/>
+          <w:sz w:val="22"/>
+          <w:szCs w:val="22"/>
+        </w:rPr>
+        <w:t xml:space="preserve"> = 1.31 (</w:t>
+      </w:r>
+      <w:r>
+        <w:rPr>
+          <w:rFonts w:ascii="Arial" w:cs="Arial" w:eastAsia="Arial" w:hAnsi="Arial"/>
+          <w:i/>
+          <w:iCs/>
+          <w:sz w:val="22"/>
+          <w:szCs w:val="22"/>
+        </w:rPr>
+        <w:t xml:space="preserve">p</w:t>
+      </w:r>
+      <w:r>
+        <w:rPr>
+          <w:rFonts w:ascii="Arial" w:cs="Arial" w:eastAsia="Arial" w:hAnsi="Arial"/>
+          <w:sz w:val="22"/>
+          <w:szCs w:val="22"/>
+        </w:rPr>
+        <w:t xml:space="preserve"> = 0.000003) for AD versus controls (Figure 3C), compared with </w:t>
+      </w:r>
+      <w:r>
+        <w:rPr>
+          <w:rFonts w:ascii="Arial" w:cs="Arial" w:eastAsia="Arial" w:hAnsi="Arial"/>
+          <w:i/>
+          <w:iCs/>
+          <w:sz w:val="22"/>
+          <w:szCs w:val="22"/>
+        </w:rPr>
+        <w:t xml:space="preserve">d</w:t>
+      </w:r>
+      <w:r>
+        <w:rPr>
+          <w:rFonts w:ascii="Arial" w:cs="Arial" w:eastAsia="Arial" w:hAnsi="Arial"/>
+          <w:sz w:val="22"/>
+          <w:szCs w:val="22"/>
+        </w:rPr>
+        <w:t xml:space="preserve"> = 1.175 for raw ρ. The nonlinear transform from ρ to the J/R ratio amplifies the biological signal because it operates on the steep portion of the mapping near ρ ≈ 1 where cortical values reside.</w:t>
       </w:r>
     </w:p>
     <w:p>

</xml_diff>